<commit_message>
Map Builing Test 1
</commit_message>
<xml_diff>
--- a/BSToDoList.docx
+++ b/BSToDoList.docx
@@ -71,11 +71,17 @@
       <w:r>
         <w:rPr>
           <w:rFonts w:hint="eastAsia"/>
+          <w:strike/>
         </w:rPr>
         <w:t>사진 찍어 저장하기</w:t>
       </w:r>
     </w:p>
     <w:p>
+      <w:pPr>
+        <w:rPr>
+          <w:strike/>
+        </w:rPr>
+      </w:pPr>
       <w:r>
         <w:rPr>
           <w:rFonts w:hint="eastAsia"/>
@@ -88,11 +94,15 @@
       <w:r>
         <w:rPr>
           <w:rFonts w:hint="eastAsia"/>
+          <w:strike/>
         </w:rPr>
         <w:t>저장한 사진 갤러리에서 확인하기</w:t>
       </w:r>
     </w:p>
-    <w:p/>
+    <w:p>
+      <w:bookmarkStart w:id="0" w:name="_GoBack"/>
+      <w:bookmarkEnd w:id="0"/>
+    </w:p>
     <w:p>
       <w:r>
         <w:rPr>
@@ -688,8 +698,6 @@
         </w:rPr>
         <w:t>테스트맵</w:t>
       </w:r>
-      <w:bookmarkStart w:id="0" w:name="_GoBack"/>
-      <w:bookmarkEnd w:id="0"/>
       <w:proofErr w:type="spellEnd"/>
     </w:p>
     <w:sectPr>

</xml_diff>

<commit_message>
Apply Landscape Photo in Gallary
- Add gallary display method that show widely-long photo.
- Set size of scrolled images.
</commit_message>
<xml_diff>
--- a/BSToDoList.docx
+++ b/BSToDoList.docx
@@ -37,7 +37,22 @@
         <w:rPr>
           <w:rFonts w:hint="eastAsia"/>
         </w:rPr>
-        <w:t>폰 기능 추가</w:t>
+        <w:t>카메라</w:t>
+      </w:r>
+      <w:r>
+        <w:t xml:space="preserve">, </w:t>
+      </w:r>
+      <w:r>
+        <w:rPr>
+          <w:rFonts w:hint="eastAsia"/>
+        </w:rPr>
+        <w:t>갤러리</w:t>
+      </w:r>
+      <w:r>
+        <w:rPr>
+          <w:rFonts w:hint="eastAsia"/>
+        </w:rPr>
+        <w:t xml:space="preserve"> 기능</w:t>
       </w:r>
     </w:p>
     <w:p>
@@ -97,6 +112,287 @@
           <w:strike/>
         </w:rPr>
         <w:t>저장한 사진 갤러리에서 확인하기</w:t>
+      </w:r>
+    </w:p>
+    <w:p/>
+    <w:p>
+      <w:r>
+        <w:rPr>
+          <w:rFonts w:hint="eastAsia"/>
+        </w:rPr>
+        <w:t>2</w:t>
+      </w:r>
+      <w:r>
+        <w:t xml:space="preserve">. </w:t>
+      </w:r>
+      <w:r>
+        <w:rPr>
+          <w:rFonts w:hint="eastAsia"/>
+        </w:rPr>
+        <w:t>실제 거리 기반 가상 맵 구현</w:t>
+      </w:r>
+    </w:p>
+    <w:p>
+      <w:r>
+        <w:rPr>
+          <w:rFonts w:hint="eastAsia"/>
+        </w:rPr>
+        <w:t xml:space="preserve"> </w:t>
+      </w:r>
+      <w:r>
+        <w:t xml:space="preserve">- </w:t>
+      </w:r>
+      <w:r>
+        <w:rPr>
+          <w:rFonts w:hint="eastAsia"/>
+          <w:strike/>
+        </w:rPr>
+        <w:t>바닥 깔기</w:t>
+      </w:r>
+    </w:p>
+    <w:p>
+      <w:pPr>
+        <w:rPr>
+          <w:rFonts w:hint="eastAsia"/>
+        </w:rPr>
+      </w:pPr>
+      <w:r>
+        <w:t xml:space="preserve"> - </w:t>
+      </w:r>
+      <w:r>
+        <w:rPr>
+          <w:rFonts w:hint="eastAsia"/>
+        </w:rPr>
+        <w:t>건물 깔기</w:t>
+      </w:r>
+    </w:p>
+    <w:p/>
+    <w:p>
+      <w:r>
+        <w:rPr>
+          <w:rFonts w:hint="eastAsia"/>
+        </w:rPr>
+        <w:t>3</w:t>
+      </w:r>
+      <w:r>
+        <w:t xml:space="preserve">. </w:t>
+      </w:r>
+      <w:proofErr w:type="spellStart"/>
+      <w:r>
+        <w:rPr>
+          <w:rFonts w:hint="eastAsia"/>
+        </w:rPr>
+        <w:t>에셋</w:t>
+      </w:r>
+      <w:proofErr w:type="spellEnd"/>
+      <w:r>
+        <w:rPr>
+          <w:rFonts w:hint="eastAsia"/>
+        </w:rPr>
+        <w:t xml:space="preserve"> 관련</w:t>
+      </w:r>
+    </w:p>
+    <w:p>
+      <w:r>
+        <w:rPr>
+          <w:rFonts w:hint="eastAsia"/>
+        </w:rPr>
+        <w:t xml:space="preserve"> </w:t>
+      </w:r>
+      <w:r>
+        <w:t xml:space="preserve">- </w:t>
+      </w:r>
+      <w:r>
+        <w:rPr>
+          <w:rFonts w:hint="eastAsia"/>
+        </w:rPr>
+        <w:t xml:space="preserve">폰 </w:t>
+      </w:r>
+      <w:proofErr w:type="spellStart"/>
+      <w:r>
+        <w:rPr>
+          <w:rFonts w:hint="eastAsia"/>
+        </w:rPr>
+        <w:t>에셋</w:t>
+      </w:r>
+      <w:proofErr w:type="spellEnd"/>
+    </w:p>
+    <w:p>
+      <w:r>
+        <w:rPr>
+          <w:rFonts w:hint="eastAsia"/>
+        </w:rPr>
+        <w:t xml:space="preserve"> </w:t>
+      </w:r>
+      <w:r>
+        <w:t xml:space="preserve">- </w:t>
+      </w:r>
+      <w:r>
+        <w:rPr>
+          <w:rFonts w:hint="eastAsia"/>
+        </w:rPr>
+        <w:t xml:space="preserve">사람 </w:t>
+      </w:r>
+      <w:proofErr w:type="spellStart"/>
+      <w:r>
+        <w:rPr>
+          <w:rFonts w:hint="eastAsia"/>
+        </w:rPr>
+        <w:t>에셋</w:t>
+      </w:r>
+      <w:proofErr w:type="spellEnd"/>
+    </w:p>
+    <w:p>
+      <w:pPr>
+        <w:rPr>
+          <w:rFonts w:hint="eastAsia"/>
+        </w:rPr>
+      </w:pPr>
+      <w:r>
+        <w:t xml:space="preserve"> - </w:t>
+      </w:r>
+      <w:r>
+        <w:rPr>
+          <w:rFonts w:hint="eastAsia"/>
+        </w:rPr>
+        <w:t xml:space="preserve">차 </w:t>
+      </w:r>
+      <w:proofErr w:type="spellStart"/>
+      <w:r>
+        <w:rPr>
+          <w:rFonts w:hint="eastAsia"/>
+        </w:rPr>
+        <w:t>에셋</w:t>
+      </w:r>
+      <w:proofErr w:type="spellEnd"/>
+    </w:p>
+    <w:p/>
+    <w:p>
+      <w:r>
+        <w:rPr>
+          <w:rFonts w:hint="eastAsia"/>
+        </w:rPr>
+        <w:t>4</w:t>
+      </w:r>
+      <w:r>
+        <w:t xml:space="preserve">. UI </w:t>
+      </w:r>
+      <w:r>
+        <w:rPr>
+          <w:rFonts w:hint="eastAsia"/>
+        </w:rPr>
+        <w:t>관련</w:t>
+      </w:r>
+    </w:p>
+    <w:p>
+      <w:r>
+        <w:rPr>
+          <w:rFonts w:hint="eastAsia"/>
+        </w:rPr>
+        <w:t xml:space="preserve"> </w:t>
+      </w:r>
+      <w:r>
+        <w:t xml:space="preserve">- </w:t>
+      </w:r>
+      <w:r>
+        <w:rPr>
+          <w:rFonts w:hint="eastAsia"/>
+          <w:strike/>
+        </w:rPr>
+        <w:t>촬영 리스트</w:t>
+      </w:r>
+      <w:r>
+        <w:rPr>
+          <w:rFonts w:hint="eastAsia"/>
+          <w:strike/>
+        </w:rPr>
+        <w:t>(미션</w:t>
+      </w:r>
+      <w:r>
+        <w:rPr>
+          <w:strike/>
+        </w:rPr>
+        <w:t>)</w:t>
+      </w:r>
+      <w:r>
+        <w:rPr>
+          <w:rFonts w:hint="eastAsia"/>
+          <w:strike/>
+        </w:rPr>
+        <w:t xml:space="preserve"> </w:t>
+      </w:r>
+      <w:r>
+        <w:rPr>
+          <w:strike/>
+        </w:rPr>
+        <w:t>UI</w:t>
+      </w:r>
+      <w:r>
+        <w:t xml:space="preserve"> -&gt; </w:t>
+      </w:r>
+      <w:r>
+        <w:rPr>
+          <w:rFonts w:hint="eastAsia"/>
+        </w:rPr>
+        <w:t>개선할 필요 있음.</w:t>
+      </w:r>
+    </w:p>
+    <w:p>
+      <w:r>
+        <w:rPr>
+          <w:rFonts w:hint="eastAsia"/>
+        </w:rPr>
+        <w:t xml:space="preserve"> </w:t>
+      </w:r>
+      <w:r>
+        <w:t xml:space="preserve">- </w:t>
+      </w:r>
+      <w:r>
+        <w:rPr>
+          <w:rFonts w:hint="eastAsia"/>
+        </w:rPr>
+        <w:t xml:space="preserve">내비게이션 </w:t>
+      </w:r>
+      <w:r>
+        <w:t>UI</w:t>
+      </w:r>
+    </w:p>
+    <w:p>
+      <w:r>
+        <w:rPr>
+          <w:rFonts w:hint="eastAsia"/>
+        </w:rPr>
+        <w:t xml:space="preserve"> </w:t>
+      </w:r>
+      <w:r>
+        <w:t xml:space="preserve">- </w:t>
+      </w:r>
+      <w:r>
+        <w:rPr>
+          <w:rFonts w:hint="eastAsia"/>
+        </w:rPr>
+        <w:t>가변해상도.</w:t>
+      </w:r>
+      <w:r>
+        <w:t xml:space="preserve"> </w:t>
+      </w:r>
+      <w:r>
+        <w:rPr>
+          <w:rFonts w:hint="eastAsia"/>
+        </w:rPr>
+        <w:t>일단 기본은 1</w:t>
+      </w:r>
+      <w:r>
+        <w:t xml:space="preserve">920 1080 </w:t>
+      </w:r>
+      <w:r>
+        <w:rPr>
+          <w:rFonts w:hint="eastAsia"/>
+        </w:rPr>
+        <w:t>세팅하고 해상도는 나중에</w:t>
+      </w:r>
+      <w:r>
+        <w:t>…</w:t>
       </w:r>
     </w:p>
     <w:p>
@@ -108,7 +404,7 @@
         <w:rPr>
           <w:rFonts w:hint="eastAsia"/>
         </w:rPr>
-        <w:t>2</w:t>
+        <w:t>5</w:t>
       </w:r>
       <w:r>
         <w:t xml:space="preserve">. </w:t>
@@ -117,7 +413,7 @@
         <w:rPr>
           <w:rFonts w:hint="eastAsia"/>
         </w:rPr>
-        <w:t>맵 관련</w:t>
+        <w:t>테크닉 관련</w:t>
       </w:r>
     </w:p>
     <w:p>
@@ -133,286 +429,7 @@
       <w:r>
         <w:rPr>
           <w:rFonts w:hint="eastAsia"/>
-        </w:rPr>
-        <w:t>실제 거리 기반 가상 맵 구현</w:t>
-      </w:r>
-      <w:r>
-        <w:rPr>
-          <w:rFonts w:hint="eastAsia"/>
-        </w:rPr>
-        <w:t>,</w:t>
-      </w:r>
-      <w:r>
-        <w:t xml:space="preserve"> </w:t>
-      </w:r>
-      <w:r>
-        <w:rPr>
-          <w:rFonts w:hint="eastAsia"/>
-        </w:rPr>
-        <w:t>맵 랜덤 생성은 정말 시간이 남으면 해보자</w:t>
-      </w:r>
-      <w:r>
-        <w:t>…</w:t>
-      </w:r>
-    </w:p>
-    <w:p>
-      <w:r>
-        <w:rPr>
-          <w:rFonts w:hint="eastAsia"/>
-        </w:rPr>
-        <w:t xml:space="preserve"> </w:t>
-      </w:r>
-      <w:r>
-        <w:t xml:space="preserve">- 3D </w:t>
-      </w:r>
-      <w:r>
-        <w:rPr>
-          <w:rFonts w:hint="eastAsia"/>
-        </w:rPr>
-        <w:t>타일 맵 구현을 한번 해볼까 말까</w:t>
-      </w:r>
-      <w:r>
-        <w:t xml:space="preserve">… </w:t>
-      </w:r>
-      <w:r>
-        <w:rPr>
-          <w:rFonts w:hint="eastAsia"/>
-        </w:rPr>
-        <w:t>고민되네</w:t>
-      </w:r>
-      <w:r>
-        <w:t>…</w:t>
-      </w:r>
-    </w:p>
-    <w:p/>
-    <w:p>
-      <w:r>
-        <w:rPr>
-          <w:rFonts w:hint="eastAsia"/>
-        </w:rPr>
-        <w:t>3</w:t>
-      </w:r>
-      <w:r>
-        <w:t xml:space="preserve">. </w:t>
-      </w:r>
-      <w:proofErr w:type="spellStart"/>
-      <w:r>
-        <w:rPr>
-          <w:rFonts w:hint="eastAsia"/>
-        </w:rPr>
-        <w:t>에셋</w:t>
-      </w:r>
-      <w:proofErr w:type="spellEnd"/>
-      <w:r>
-        <w:rPr>
-          <w:rFonts w:hint="eastAsia"/>
-        </w:rPr>
-        <w:t xml:space="preserve"> 관련</w:t>
-      </w:r>
-    </w:p>
-    <w:p>
-      <w:r>
-        <w:rPr>
-          <w:rFonts w:hint="eastAsia"/>
-        </w:rPr>
-        <w:t xml:space="preserve"> </w:t>
-      </w:r>
-      <w:r>
-        <w:t xml:space="preserve">- </w:t>
-      </w:r>
-      <w:r>
-        <w:rPr>
-          <w:rFonts w:hint="eastAsia"/>
-        </w:rPr>
-        <w:t xml:space="preserve">폰 </w:t>
-      </w:r>
-      <w:proofErr w:type="spellStart"/>
-      <w:r>
-        <w:rPr>
-          <w:rFonts w:hint="eastAsia"/>
-        </w:rPr>
-        <w:t>에셋도</w:t>
-      </w:r>
-      <w:proofErr w:type="spellEnd"/>
-      <w:r>
-        <w:rPr>
-          <w:rFonts w:hint="eastAsia"/>
-        </w:rPr>
-        <w:t xml:space="preserve"> 있어야 하나?</w:t>
-      </w:r>
-    </w:p>
-    <w:p>
-      <w:r>
-        <w:rPr>
-          <w:rFonts w:hint="eastAsia"/>
-        </w:rPr>
-        <w:t xml:space="preserve"> </w:t>
-      </w:r>
-      <w:r>
-        <w:t xml:space="preserve">- </w:t>
-      </w:r>
-      <w:r>
-        <w:rPr>
-          <w:rFonts w:hint="eastAsia"/>
-        </w:rPr>
-        <w:t xml:space="preserve">손과 사람 </w:t>
-      </w:r>
-      <w:proofErr w:type="spellStart"/>
-      <w:r>
-        <w:rPr>
-          <w:rFonts w:hint="eastAsia"/>
-        </w:rPr>
-        <w:t>에셋</w:t>
-      </w:r>
-      <w:proofErr w:type="spellEnd"/>
-      <w:r>
-        <w:rPr>
-          <w:rFonts w:hint="eastAsia"/>
-        </w:rPr>
-        <w:t xml:space="preserve"> 구해서 </w:t>
-      </w:r>
-      <w:proofErr w:type="spellStart"/>
-      <w:r>
-        <w:rPr>
-          <w:rFonts w:hint="eastAsia"/>
-        </w:rPr>
-        <w:t>적용해봐야함</w:t>
-      </w:r>
-      <w:proofErr w:type="spellEnd"/>
-      <w:r>
-        <w:rPr>
-          <w:rFonts w:hint="eastAsia"/>
-        </w:rPr>
-        <w:t>.</w:t>
-      </w:r>
-    </w:p>
-    <w:p/>
-    <w:p>
-      <w:r>
-        <w:rPr>
-          <w:rFonts w:hint="eastAsia"/>
-        </w:rPr>
-        <w:t>4</w:t>
-      </w:r>
-      <w:r>
-        <w:t xml:space="preserve">. UI </w:t>
-      </w:r>
-      <w:r>
-        <w:rPr>
-          <w:rFonts w:hint="eastAsia"/>
-        </w:rPr>
-        <w:t>관련</w:t>
-      </w:r>
-    </w:p>
-    <w:p>
-      <w:r>
-        <w:rPr>
-          <w:rFonts w:hint="eastAsia"/>
-        </w:rPr>
-        <w:t xml:space="preserve"> </w:t>
-      </w:r>
-      <w:r>
-        <w:t xml:space="preserve">- </w:t>
-      </w:r>
-      <w:r>
-        <w:rPr>
-          <w:rFonts w:hint="eastAsia"/>
-        </w:rPr>
-        <w:t xml:space="preserve">촬영 리스트 </w:t>
-      </w:r>
-      <w:r>
-        <w:t>UI</w:t>
-      </w:r>
-    </w:p>
-    <w:p>
-      <w:r>
-        <w:rPr>
-          <w:rFonts w:hint="eastAsia"/>
-        </w:rPr>
-        <w:t xml:space="preserve"> </w:t>
-      </w:r>
-      <w:r>
-        <w:t xml:space="preserve">- </w:t>
-      </w:r>
-      <w:r>
-        <w:rPr>
-          <w:rFonts w:hint="eastAsia"/>
-        </w:rPr>
-        <w:t xml:space="preserve">내비게이션 </w:t>
-      </w:r>
-      <w:r>
-        <w:t>UI</w:t>
-      </w:r>
-    </w:p>
-    <w:p>
-      <w:r>
-        <w:rPr>
-          <w:rFonts w:hint="eastAsia"/>
-        </w:rPr>
-        <w:t xml:space="preserve"> </w:t>
-      </w:r>
-      <w:r>
-        <w:t xml:space="preserve">- </w:t>
-      </w:r>
-      <w:r>
-        <w:rPr>
-          <w:rFonts w:hint="eastAsia"/>
-        </w:rPr>
-        <w:t>가변해상도.</w:t>
-      </w:r>
-      <w:r>
-        <w:t xml:space="preserve"> </w:t>
-      </w:r>
-      <w:r>
-        <w:rPr>
-          <w:rFonts w:hint="eastAsia"/>
-        </w:rPr>
-        <w:t>일단 기본은 1</w:t>
-      </w:r>
-      <w:r>
-        <w:t xml:space="preserve">920 1080 </w:t>
-      </w:r>
-      <w:r>
-        <w:rPr>
-          <w:rFonts w:hint="eastAsia"/>
-        </w:rPr>
-        <w:t>세팅하고 해상도는 나중에</w:t>
-      </w:r>
-      <w:r>
-        <w:t>…</w:t>
-      </w:r>
-    </w:p>
-    <w:p/>
-    <w:p>
-      <w:r>
-        <w:rPr>
-          <w:rFonts w:hint="eastAsia"/>
-        </w:rPr>
-        <w:t>5</w:t>
-      </w:r>
-      <w:r>
-        <w:t xml:space="preserve">. </w:t>
-      </w:r>
-      <w:r>
-        <w:rPr>
-          <w:rFonts w:hint="eastAsia"/>
-        </w:rPr>
-        <w:t>테크닉 관련</w:t>
-      </w:r>
-    </w:p>
-    <w:p>
-      <w:r>
-        <w:rPr>
-          <w:rFonts w:hint="eastAsia"/>
-        </w:rPr>
-        <w:t xml:space="preserve"> </w:t>
-      </w:r>
-      <w:r>
-        <w:t xml:space="preserve">- </w:t>
-      </w:r>
-      <w:r>
-        <w:rPr>
-          <w:rFonts w:hint="eastAsia"/>
+          <w:strike/>
         </w:rPr>
         <w:t>사진을 통해 과제를 완수했는지 판별</w:t>
       </w:r>
@@ -479,7 +496,6 @@
         <w:rPr>
           <w:rFonts w:hint="eastAsia"/>
         </w:rPr>
-        <w:lastRenderedPageBreak/>
         <w:t>6</w:t>
       </w:r>
       <w:r>
@@ -623,82 +639,6 @@
         </w:rPr>
         <w:t>…?</w:t>
       </w:r>
-    </w:p>
-    <w:p/>
-    <w:p/>
-    <w:p>
-      <w:r>
-        <w:rPr>
-          <w:rFonts w:hint="eastAsia"/>
-        </w:rPr>
-        <w:t>프로토 타입(</w:t>
-      </w:r>
-      <w:proofErr w:type="spellStart"/>
-      <w:r>
-        <w:rPr>
-          <w:rFonts w:hint="eastAsia"/>
-        </w:rPr>
-        <w:t>개총</w:t>
-      </w:r>
-      <w:proofErr w:type="spellEnd"/>
-      <w:r>
-        <w:rPr>
-          <w:rFonts w:hint="eastAsia"/>
-        </w:rPr>
-        <w:t xml:space="preserve"> 목표</w:t>
-      </w:r>
-      <w:r>
-        <w:t>)</w:t>
-      </w:r>
-      <w:r>
-        <w:rPr>
-          <w:rFonts w:hint="eastAsia"/>
-        </w:rPr>
-        <w:t xml:space="preserve"> 목표</w:t>
-      </w:r>
-    </w:p>
-    <w:p>
-      <w:pPr>
-        <w:pStyle w:val="a4"/>
-        <w:numPr>
-          <w:ilvl w:val="0"/>
-          <w:numId w:val="1"/>
-        </w:numPr>
-        <w:ind w:leftChars="0"/>
-      </w:pPr>
-      <w:r>
-        <w:rPr>
-          <w:rFonts w:hint="eastAsia"/>
-        </w:rPr>
-        <w:t>폰 기능 구현(사진 판별까지.</w:t>
-      </w:r>
-      <w:r>
-        <w:t>)</w:t>
-      </w:r>
-    </w:p>
-    <w:p>
-      <w:pPr>
-        <w:pStyle w:val="a4"/>
-        <w:numPr>
-          <w:ilvl w:val="0"/>
-          <w:numId w:val="1"/>
-        </w:numPr>
-        <w:ind w:leftChars="0"/>
-      </w:pPr>
-      <w:r>
-        <w:rPr>
-          <w:rFonts w:hint="eastAsia"/>
-        </w:rPr>
-        <w:t xml:space="preserve">간단한 </w:t>
-      </w:r>
-      <w:proofErr w:type="spellStart"/>
-      <w:r>
-        <w:rPr>
-          <w:rFonts w:hint="eastAsia"/>
-        </w:rPr>
-        <w:t>테스트맵</w:t>
-      </w:r>
-      <w:proofErr w:type="spellEnd"/>
     </w:p>
     <w:sectPr>
       <w:pgSz w:w="11906" w:h="16838"/>
@@ -849,7 +789,7 @@
       </w:pPr>
     </w:pPrDefault>
   </w:docDefaults>
-  <w:latentStyles w:defLockedState="0" w:defUIPriority="99" w:defSemiHidden="0" w:defUnhideWhenUsed="0" w:defQFormat="0" w:count="375">
+  <w:latentStyles w:defLockedState="0" w:defUIPriority="99" w:defSemiHidden="0" w:defUnhideWhenUsed="0" w:defQFormat="0" w:count="377">
     <w:lsdException w:name="Normal" w:uiPriority="0" w:qFormat="1"/>
     <w:lsdException w:name="heading 1" w:uiPriority="9" w:qFormat="1"/>
     <w:lsdException w:name="heading 2" w:semiHidden="1" w:uiPriority="9" w:unhideWhenUsed="1" w:qFormat="1"/>
@@ -955,7 +895,6 @@
     <w:lsdException w:name="HTML Sample" w:semiHidden="1" w:unhideWhenUsed="1"/>
     <w:lsdException w:name="HTML Typewriter" w:semiHidden="1" w:unhideWhenUsed="1"/>
     <w:lsdException w:name="HTML Variable" w:semiHidden="1" w:unhideWhenUsed="1"/>
-    <w:lsdException w:name="Normal Table" w:semiHidden="1" w:unhideWhenUsed="1"/>
     <w:lsdException w:name="annotation subject" w:semiHidden="1" w:unhideWhenUsed="1"/>
     <w:lsdException w:name="No List" w:semiHidden="1" w:unhideWhenUsed="1"/>
     <w:lsdException w:name="Outline List 1" w:semiHidden="1" w:unhideWhenUsed="1"/>
@@ -1001,11 +940,9 @@
     <w:lsdException w:name="Table Subtle 1" w:semiHidden="1" w:unhideWhenUsed="1"/>
     <w:lsdException w:name="Table Subtle 2" w:semiHidden="1" w:unhideWhenUsed="1"/>
     <w:lsdException w:name="Table Web 1" w:semiHidden="1" w:unhideWhenUsed="1"/>
-    <w:lsdException w:name="Table Web 2" w:semiHidden="1" w:unhideWhenUsed="1"/>
     <w:lsdException w:name="Table Web 3" w:semiHidden="1" w:unhideWhenUsed="1"/>
     <w:lsdException w:name="Balloon Text" w:semiHidden="1" w:unhideWhenUsed="1"/>
     <w:lsdException w:name="Table Grid" w:uiPriority="39"/>
-    <w:lsdException w:name="Table Theme" w:semiHidden="1" w:unhideWhenUsed="1"/>
     <w:lsdException w:name="Placeholder Text" w:semiHidden="1"/>
     <w:lsdException w:name="No Spacing" w:uiPriority="1" w:qFormat="1"/>
     <w:lsdException w:name="Light Shading" w:uiPriority="60"/>
@@ -1225,6 +1162,8 @@
     <w:lsdException w:name="Smart Hyperlink" w:semiHidden="1" w:unhideWhenUsed="1"/>
     <w:lsdException w:name="Hashtag" w:semiHidden="1" w:unhideWhenUsed="1"/>
     <w:lsdException w:name="Unresolved Mention" w:semiHidden="1" w:unhideWhenUsed="1"/>
+    <w:lsdException w:name="Smart Link" w:semiHidden="1" w:unhideWhenUsed="1"/>
+    <w:lsdException w:name="Smart Link Error" w:semiHidden="1" w:unhideWhenUsed="1"/>
   </w:latentStyles>
   <w:style w:type="paragraph" w:default="1" w:styleId="a">
     <w:name w:val="Normal"/>

</xml_diff>